<commit_message>
Add ground-truth benchmarks for Beetroot (94%), Mango (94%), Banana (96%), Carrot (96%), and lower default conf to 0.25
</commit_message>
<xml_diff>
--- a/Smart_Pantry_ICAIHC_Final.docx
+++ b/Smart_Pantry_ICAIHC_Final.docx
@@ -8393,14 +8393,11 @@
         <w:jc w:val="center"/>
       </w:pPr>
       <w:r>
-        <w:rPr>
-          <w:noProof/>
-        </w:rPr>
         <w:drawing>
-          <wp:inline distT="0" distB="0" distL="0" distR="0">
-            <wp:extent cx="3657600" cy="3314700"/>
-            <wp:effectExtent l="0" t="0" r="0" b="0"/>
-            <wp:docPr id="513051529" name="f_cm.png" descr="Fig. 8. Confusion matrix of the best checkpoint on the validation set (rows: predicted class, columns: true class)." title="Fig. 8. Confusion matrix of the best checkpoint on the validation set (rows: predicted class, columns: true class)."/>
+          <wp:inline distT="0" distB="0" distL="0" distR="0" wp14:anchorId="6D2D53DA" wp14:editId="6AF40219">
+            <wp:extent cx="4719204" cy="3539634"/>
+            <wp:effectExtent l="0" t="0" r="5715" b="3810"/>
+            <wp:docPr id="1426674333" name="Picture 1"/>
             <wp:cNvGraphicFramePr>
               <a:graphicFrameLocks xmlns:a="http://schemas.openxmlformats.org/drawingml/2006/main" noChangeAspect="1"/>
             </wp:cNvGraphicFramePr>
@@ -8408,22 +8405,19 @@
               <a:graphicData uri="http://schemas.openxmlformats.org/drawingml/2006/picture">
                 <pic:pic xmlns:pic="http://schemas.openxmlformats.org/drawingml/2006/picture">
                   <pic:nvPicPr>
-                    <pic:cNvPr id="0" name=""/>
-                    <pic:cNvPicPr>
-                      <a:picLocks noChangeAspect="1" noChangeArrowheads="1"/>
-                    </pic:cNvPicPr>
+                    <pic:cNvPr id="1426674333" name=""/>
+                    <pic:cNvPicPr/>
                   </pic:nvPicPr>
                   <pic:blipFill>
                     <a:blip r:embed="rId17"/>
-                    <a:srcRect/>
                     <a:stretch>
                       <a:fillRect/>
                     </a:stretch>
                   </pic:blipFill>
-                  <pic:spPr bwMode="auto">
+                  <pic:spPr>
                     <a:xfrm>
                       <a:off x="0" y="0"/>
-                      <a:ext cx="3657600" cy="3314700"/>
+                      <a:ext cx="4766513" cy="3575118"/>
                     </a:xfrm>
                     <a:prstGeom prst="rect">
                       <a:avLst/>
@@ -8467,6 +8461,7 @@
         <w:jc w:val="both"/>
       </w:pPr>
       <w:r>
+        <w:lastRenderedPageBreak/>
         <w:t xml:space="preserve">Fig. 9(a, b) illustrates this </w:t>
       </w:r>
       <w:proofErr w:type="spellStart"/>
@@ -8475,17 +8470,10 @@
       </w:r>
       <w:proofErr w:type="spellEnd"/>
       <w:r>
-        <w:t xml:space="preserve">. On isolated objects such as apples, bananas, oranges and carrots, predictions </w:t>
-      </w:r>
-      <w:r>
-        <w:t xml:space="preserve">match the labels with confidences of 0.8 to 1.0. In the potato pile, the model produces many overlapping boxes at low </w:t>
-      </w:r>
-      <w:r>
-        <w:lastRenderedPageBreak/>
-        <w:t xml:space="preserve">confidence, and the dense labels in the same image are hard to match one-to-one. Fig. 9(c, d) shows two further problems. Several red radishes are annotated as Turnip, which explains </w:t>
-      </w:r>
-      <w:r>
-        <w:t>why the Radish class is almost empty in Fig. 8 and why Turnip scores poorly in Table III. A small ginger next to a picture of turmeric is also missed.</w:t>
+        <w:t xml:space="preserve">. On isolated objects such as apples, bananas, oranges and carrots, predictions match the labels with confidences of 0.8 to 1.0. In the potato pile, the model produces many overlapping boxes at low confidence, and the dense labels in the same image are hard to </w:t>
+      </w:r>
+      <w:r>
+        <w:t>match one-to-one. Fig. 9(c, d) shows two further problems. Several red radishes are annotated as Turnip, which explains why the Radish class is almost empty in Fig. 8 and why Turnip scores poorly in Table III. A small ginger next to a picture of turmeric is also missed.</w:t>
       </w:r>
     </w:p>
     <w:p>
@@ -10465,11 +10453,11 @@
         <w:jc w:val="both"/>
       </w:pPr>
       <w:r>
-        <w:t xml:space="preserve">The results show that a medium-sized convolutional detector can run directly on a consumer phone and still give accurate, practical output without depending on a server. An mAP@50 of 91.3% is good enough for everyday pantry tracking. Distinctive items such as Apple, Banana and Cabbage are detected almost perfectly. The weakest classes, Turnip and Melon, score much lower. For Turnip the cause is partly label noise, since radishes are annotated as turnips in the data, and for Melon it is most likely the small number of varied examples. The review screen handles such cases well: </w:t>
+        <w:t xml:space="preserve">The results show that a medium-sized convolutional detector can run directly on a consumer phone and still give accurate, practical output without depending on a server. An mAP@50 of 91.3% is good enough for everyday pantry tracking. Distinctive items such as Apple, Banana and Cabbage are detected almost perfectly. The weakest classes, Turnip and Melon, score much lower. For Turnip the cause is partly label noise, since radishes are annotated as turnips in </w:t>
       </w:r>
       <w:r>
         <w:lastRenderedPageBreak/>
-        <w:t>when the model is wrong the user corrects it, and the correction is recorded as useful feedback data.</w:t>
+        <w:t>the data, and for Melon it is most likely the small number of varied examples. The review screen handles such cases well: when the model is wrong the user corrects it, and the correction is recorded as useful feedback data.</w:t>
       </w:r>
     </w:p>
     <w:p>

</xml_diff>